<commit_message>
Keep signature blocks together; fix Exhibit B indent and spacing
- keepNext chains on signature lines, name/date labels, section headings,
  and centered titles so blocks can no longer split across page breaks
- Exhibit B interstitial paragraph aligned with numbered items (0.5 inch
  left indent, 6pt spacing before/after) per attorney formatting spec

Co-Authored-By: Claude Fable 5 <noreply@anthropic.com>
</commit_message>
<xml_diff>
--- a/templates/ra/RA-EP-Couple-tokenized.docx
+++ b/templates/ra/RA-EP-Couple-tokenized.docx
@@ -4,6 +4,7 @@
   <w:body>
     <w:p>
       <w:pPr>
+        <w:keepNext/>
         <w:spacing w:after="240" w:before="120"/>
         <w:jc w:val="center"/>
       </w:pPr>
@@ -349,7 +350,7 @@
         </w:rPr>
         <w:t xml:space="preserve">For your convenience, and if payment was not made during the discovery call, you may use the following link to pay in full: </w:t>
       </w:r>
-      <w:hyperlink w:history="1" r:id="rIdwhzfmqxknbqzupzd4pysi">
+      <w:hyperlink w:history="1" r:id="rIdb7akpoyondzieagyqmkgp">
         <w:r>
           <w:rPr>
             <w:rStyle w:val="Hyperlink"/>
@@ -405,6 +406,7 @@
     </w:p>
     <w:p>
       <w:pPr>
+        <w:keepNext/>
         <w:spacing w:after="40" w:before="480"/>
       </w:pPr>
       <w:r>
@@ -418,6 +420,7 @@
     </w:p>
     <w:p>
       <w:pPr>
+        <w:keepNext/>
         <w:spacing w:after="40"/>
       </w:pPr>
       <w:r>
@@ -431,6 +434,7 @@
     </w:p>
     <w:p>
       <w:pPr>
+        <w:keepNext/>
         <w:spacing w:after="40"/>
       </w:pPr>
       <w:r>
@@ -444,6 +448,7 @@
     </w:p>
     <w:p>
       <w:pPr>
+        <w:keepNext/>
         <w:spacing w:after="40" w:before="480"/>
       </w:pPr>
       <w:r>
@@ -457,6 +462,7 @@
     </w:p>
     <w:p>
       <w:pPr>
+        <w:keepNext/>
         <w:spacing w:after="40"/>
       </w:pPr>
       <w:r>
@@ -470,6 +476,7 @@
     </w:p>
     <w:p>
       <w:pPr>
+        <w:keepNext w:val="false"/>
         <w:spacing w:after="40"/>
       </w:pPr>
       <w:r>
@@ -488,6 +495,7 @@
     </w:p>
     <w:p>
       <w:pPr>
+        <w:keepNext/>
         <w:spacing w:after="240" w:before="120"/>
         <w:jc w:val="center"/>
       </w:pPr>
@@ -505,6 +513,7 @@
     <w:p>
       <w:pPr>
         <w:pStyle w:val="ListParagraph"/>
+        <w:keepNext/>
         <w:numPr>
           <w:ilvl w:val="0"/>
           <w:numId w:val="2"/>
@@ -539,6 +548,7 @@
     <w:p>
       <w:pPr>
         <w:pStyle w:val="ListParagraph"/>
+        <w:keepNext/>
         <w:numPr>
           <w:ilvl w:val="0"/>
           <w:numId w:val="2"/>
@@ -615,6 +625,7 @@
     <w:p>
       <w:pPr>
         <w:pStyle w:val="ListParagraph"/>
+        <w:keepNext/>
         <w:numPr>
           <w:ilvl w:val="0"/>
           <w:numId w:val="2"/>
@@ -649,6 +660,7 @@
     <w:p>
       <w:pPr>
         <w:pStyle w:val="ListParagraph"/>
+        <w:keepNext/>
         <w:numPr>
           <w:ilvl w:val="0"/>
           <w:numId w:val="2"/>
@@ -683,6 +695,7 @@
     <w:p>
       <w:pPr>
         <w:pStyle w:val="ListParagraph"/>
+        <w:keepNext/>
         <w:numPr>
           <w:ilvl w:val="0"/>
           <w:numId w:val="2"/>
@@ -717,6 +730,7 @@
     <w:p>
       <w:pPr>
         <w:pStyle w:val="ListParagraph"/>
+        <w:keepNext/>
         <w:numPr>
           <w:ilvl w:val="0"/>
           <w:numId w:val="2"/>
@@ -751,6 +765,7 @@
     <w:p>
       <w:pPr>
         <w:pStyle w:val="ListParagraph"/>
+        <w:keepNext/>
         <w:numPr>
           <w:ilvl w:val="0"/>
           <w:numId w:val="2"/>
@@ -785,6 +800,7 @@
     <w:p>
       <w:pPr>
         <w:pStyle w:val="ListParagraph"/>
+        <w:keepNext/>
         <w:numPr>
           <w:ilvl w:val="0"/>
           <w:numId w:val="2"/>
@@ -819,6 +835,7 @@
     <w:p>
       <w:pPr>
         <w:pStyle w:val="ListParagraph"/>
+        <w:keepNext/>
         <w:numPr>
           <w:ilvl w:val="0"/>
           <w:numId w:val="2"/>
@@ -853,6 +870,7 @@
     <w:p>
       <w:pPr>
         <w:pStyle w:val="ListParagraph"/>
+        <w:keepNext/>
         <w:numPr>
           <w:ilvl w:val="0"/>
           <w:numId w:val="2"/>
@@ -902,6 +920,7 @@
     </w:p>
     <w:p>
       <w:pPr>
+        <w:keepNext/>
         <w:spacing w:after="40" w:before="240"/>
       </w:pPr>
       <w:r>
@@ -917,6 +936,7 @@
     </w:p>
     <w:p>
       <w:pPr>
+        <w:keepNext/>
         <w:spacing w:after="40" w:before="480"/>
       </w:pPr>
       <w:r>
@@ -930,6 +950,7 @@
     </w:p>
     <w:p>
       <w:pPr>
+        <w:keepNext/>
         <w:spacing w:after="40"/>
       </w:pPr>
       <w:r>
@@ -943,6 +964,7 @@
     </w:p>
     <w:p>
       <w:pPr>
+        <w:keepNext/>
         <w:spacing w:after="40"/>
       </w:pPr>
       <w:r>
@@ -956,6 +978,7 @@
     </w:p>
     <w:p>
       <w:pPr>
+        <w:keepNext/>
         <w:spacing w:after="40"/>
       </w:pPr>
       <w:r>
@@ -969,6 +992,7 @@
     </w:p>
     <w:p>
       <w:pPr>
+        <w:keepNext/>
         <w:spacing w:after="40"/>
       </w:pPr>
       <w:r>
@@ -982,6 +1006,7 @@
     </w:p>
     <w:p>
       <w:pPr>
+        <w:keepNext w:val="false"/>
         <w:spacing w:after="40"/>
       </w:pPr>
       <w:r>
@@ -995,6 +1020,7 @@
     </w:p>
     <w:p>
       <w:pPr>
+        <w:keepNext/>
         <w:spacing w:after="40" w:before="240"/>
       </w:pPr>
       <w:r>
@@ -1010,6 +1036,7 @@
     </w:p>
     <w:p>
       <w:pPr>
+        <w:keepNext/>
         <w:spacing w:after="40" w:before="480"/>
       </w:pPr>
       <w:r>
@@ -1023,6 +1050,7 @@
     </w:p>
     <w:p>
       <w:pPr>
+        <w:keepNext/>
         <w:spacing w:after="40"/>
       </w:pPr>
       <w:r>
@@ -1036,6 +1064,7 @@
     </w:p>
     <w:p>
       <w:pPr>
+        <w:keepNext/>
         <w:spacing w:after="40"/>
       </w:pPr>
       <w:r>
@@ -1049,6 +1078,7 @@
     </w:p>
     <w:p>
       <w:pPr>
+        <w:keepNext/>
         <w:spacing w:after="40" w:before="480"/>
       </w:pPr>
       <w:r>
@@ -1062,6 +1092,7 @@
     </w:p>
     <w:p>
       <w:pPr>
+        <w:keepNext/>
         <w:spacing w:after="40"/>
       </w:pPr>
       <w:r>
@@ -1075,6 +1106,7 @@
     </w:p>
     <w:p>
       <w:pPr>
+        <w:keepNext w:val="false"/>
         <w:spacing w:after="40"/>
       </w:pPr>
       <w:r>
@@ -1093,6 +1125,7 @@
     </w:p>
     <w:p>
       <w:pPr>
+        <w:keepNext/>
         <w:spacing w:after="240" w:before="120"/>
         <w:jc w:val="center"/>
       </w:pPr>
@@ -1123,6 +1156,7 @@
     </w:p>
     <w:p>
       <w:pPr>
+        <w:keepNext/>
         <w:spacing w:after="40" w:before="480"/>
       </w:pPr>
       <w:r>
@@ -1136,6 +1170,7 @@
     </w:p>
     <w:p>
       <w:pPr>
+        <w:keepNext/>
         <w:spacing w:after="40"/>
       </w:pPr>
       <w:r>
@@ -1149,6 +1184,7 @@
     </w:p>
     <w:p>
       <w:pPr>
+        <w:keepNext/>
         <w:spacing w:after="40"/>
       </w:pPr>
       <w:r>
@@ -1162,6 +1198,7 @@
     </w:p>
     <w:p>
       <w:pPr>
+        <w:keepNext/>
         <w:spacing w:after="40" w:before="480"/>
       </w:pPr>
       <w:r>
@@ -1175,6 +1212,7 @@
     </w:p>
     <w:p>
       <w:pPr>
+        <w:keepNext/>
         <w:spacing w:after="40"/>
       </w:pPr>
       <w:r>
@@ -1188,6 +1226,7 @@
     </w:p>
     <w:p>
       <w:pPr>
+        <w:keepNext w:val="false"/>
         <w:spacing w:after="40"/>
       </w:pPr>
       <w:r>
@@ -1201,6 +1240,7 @@
     </w:p>
     <w:p>
       <w:pPr>
+        <w:keepNext/>
         <w:spacing w:after="240" w:before="120"/>
         <w:jc w:val="center"/>
       </w:pPr>
@@ -1231,6 +1271,7 @@
     </w:p>
     <w:p>
       <w:pPr>
+        <w:keepNext/>
         <w:spacing w:after="40" w:before="480"/>
       </w:pPr>
       <w:r>
@@ -1244,6 +1285,7 @@
     </w:p>
     <w:p>
       <w:pPr>
+        <w:keepNext/>
         <w:spacing w:after="40"/>
       </w:pPr>
       <w:r>
@@ -1257,6 +1299,7 @@
     </w:p>
     <w:p>
       <w:pPr>
+        <w:keepNext/>
         <w:spacing w:after="40"/>
       </w:pPr>
       <w:r>
@@ -1270,6 +1313,7 @@
     </w:p>
     <w:p>
       <w:pPr>
+        <w:keepNext/>
         <w:spacing w:after="40" w:before="480"/>
       </w:pPr>
       <w:r>
@@ -1283,6 +1327,7 @@
     </w:p>
     <w:p>
       <w:pPr>
+        <w:keepNext/>
         <w:spacing w:after="40"/>
       </w:pPr>
       <w:r>
@@ -1296,6 +1341,7 @@
     </w:p>
     <w:p>
       <w:pPr>
+        <w:keepNext w:val="false"/>
         <w:spacing w:after="40"/>
       </w:pPr>
       <w:r>
@@ -1314,6 +1360,7 @@
     </w:p>
     <w:p>
       <w:pPr>
+        <w:keepNext/>
         <w:spacing w:after="240" w:before="120"/>
         <w:jc w:val="center"/>
       </w:pPr>
@@ -1330,6 +1377,7 @@
     </w:p>
     <w:p>
       <w:pPr>
+        <w:keepNext/>
         <w:spacing w:after="240" w:before="120"/>
         <w:jc w:val="center"/>
       </w:pPr>
@@ -1708,6 +1756,7 @@
     </w:p>
     <w:p>
       <w:pPr>
+        <w:keepNext/>
         <w:spacing w:after="40" w:before="480"/>
       </w:pPr>
       <w:r>
@@ -1721,6 +1770,7 @@
     </w:p>
     <w:p>
       <w:pPr>
+        <w:keepNext/>
         <w:spacing w:after="40"/>
       </w:pPr>
       <w:r>
@@ -1734,6 +1784,7 @@
     </w:p>
     <w:p>
       <w:pPr>
+        <w:keepNext/>
         <w:spacing w:after="40"/>
       </w:pPr>
       <w:r>
@@ -1747,6 +1798,7 @@
     </w:p>
     <w:p>
       <w:pPr>
+        <w:keepNext/>
         <w:spacing w:after="40" w:before="480"/>
       </w:pPr>
       <w:r>
@@ -1760,6 +1812,7 @@
     </w:p>
     <w:p>
       <w:pPr>
+        <w:keepNext/>
         <w:spacing w:after="40"/>
       </w:pPr>
       <w:r>
@@ -1773,6 +1826,7 @@
     </w:p>
     <w:p>
       <w:pPr>
+        <w:keepNext w:val="false"/>
         <w:spacing w:after="40"/>
       </w:pPr>
       <w:r>
@@ -1791,6 +1845,7 @@
     </w:p>
     <w:p>
       <w:pPr>
+        <w:keepNext/>
         <w:spacing w:after="240" w:before="120"/>
         <w:jc w:val="center"/>
       </w:pPr>
@@ -1807,6 +1862,7 @@
     </w:p>
     <w:p>
       <w:pPr>
+        <w:keepNext/>
         <w:spacing w:after="240" w:before="120"/>
         <w:jc w:val="center"/>
       </w:pPr>
@@ -1895,7 +1951,8 @@
     </w:p>
     <w:p>
       <w:pPr>
-        <w:spacing w:after="160"/>
+        <w:spacing w:after="120" w:before="120"/>
+        <w:ind w:left="720"/>
         <w:jc w:val="both"/>
       </w:pPr>
       <w:r>
@@ -2031,6 +2088,7 @@
     </w:p>
     <w:p>
       <w:pPr>
+        <w:keepNext/>
         <w:spacing w:after="40" w:before="480"/>
       </w:pPr>
       <w:r>
@@ -2044,6 +2102,7 @@
     </w:p>
     <w:p>
       <w:pPr>
+        <w:keepNext/>
         <w:spacing w:after="40"/>
       </w:pPr>
       <w:r>
@@ -2057,6 +2116,7 @@
     </w:p>
     <w:p>
       <w:pPr>
+        <w:keepNext/>
         <w:spacing w:after="40"/>
       </w:pPr>
       <w:r>
@@ -2070,6 +2130,7 @@
     </w:p>
     <w:p>
       <w:pPr>
+        <w:keepNext/>
         <w:spacing w:after="40" w:before="480"/>
       </w:pPr>
       <w:r>
@@ -2083,6 +2144,7 @@
     </w:p>
     <w:p>
       <w:pPr>
+        <w:keepNext/>
         <w:spacing w:after="40"/>
       </w:pPr>
       <w:r>
@@ -2096,6 +2158,7 @@
     </w:p>
     <w:p>
       <w:pPr>
+        <w:keepNext w:val="false"/>
         <w:spacing w:after="40"/>
       </w:pPr>
       <w:r>

</xml_diff>

<commit_message>
Add blank line before fee table; more space before Limited POA title
Co-Authored-By: Claude Fable 5 <noreply@anthropic.com>
</commit_message>
<xml_diff>
--- a/templates/ra/RA-EP-Couple-tokenized.docx
+++ b/templates/ra/RA-EP-Couple-tokenized.docx
@@ -32,6 +32,11 @@
         </w:rPr>
         <w:t xml:space="preserve">The following proposal outlines your selected attorney tier, service features, and courtesy adjustments for [[ClientFullName]] and [[SpouseFullName]]. These selections form the basis of your flat-fee estate planning engagement with Speedwell Law. Only the services you selected appear below. You may ask your intake specialist to revise and resend according to your desires. If you have scheduled a design meeting, this Representation Agreement must be signed within 24 hours of the discovery call to keep your meeting on our calendar. In addition, please accept the meeting invitation to confirm the meeting. If we do not receive a signed Representation Agreement and are unable to reach you, the meeting may be canceled so the time can be released.</w:t>
       </w:r>
+    </w:p>
+    <w:p>
+      <w:pPr>
+        <w:spacing w:after="0"/>
+      </w:pPr>
     </w:p>
     <w:tbl>
       <w:tblPr>
@@ -350,7 +355,7 @@
         </w:rPr>
         <w:t xml:space="preserve">For your convenience, and if payment was not made during the discovery call, you may use the following link to pay in full: </w:t>
       </w:r>
-      <w:hyperlink w:history="1" r:id="rIdb7akpoyondzieagyqmkgp">
+      <w:hyperlink w:history="1" r:id="rId4s0plzpsfgwqlfxzruas9">
         <w:r>
           <w:rPr>
             <w:rStyle w:val="Hyperlink"/>
@@ -1241,7 +1246,7 @@
     <w:p>
       <w:pPr>
         <w:keepNext/>
-        <w:spacing w:after="240" w:before="120"/>
+        <w:spacing w:after="240" w:before="720"/>
         <w:jc w:val="center"/>
       </w:pPr>
       <w:r>

</xml_diff>

<commit_message>
Update 2026 rate card on both RA templates
Per Misha: Premium $625->$675, Senior $450->$525, Associate $350->$400
(Paralegal $185, Legal Assistant $125 unchanged). Senior bump reflects a
5-year attorney joining in July.

- General/hourly RA Exhibit A now leads with a Premium Attorney row.
- EP couple RA Exhibit A rates updated to match.
- Rate year is now a single RATE_YEAR constant in each builder (one-line
  annual bump instead of editing the document text).

Both regenerated and verified: new rates present, old rates gone, signing
anchors intact (6 in couple RA, 4 in general RA).

Co-Authored-By: Claude Opus 4.8 <noreply@anthropic.com>
</commit_message>
<xml_diff>
--- a/templates/ra/RA-EP-Couple-tokenized.docx
+++ b/templates/ra/RA-EP-Couple-tokenized.docx
@@ -355,7 +355,7 @@
         </w:rPr>
         <w:t xml:space="preserve">For your convenience, and if payment was not made during the discovery call, you may use the following link to pay in full: </w:t>
       </w:r>
-      <w:hyperlink w:history="1" r:id="rId4r6xndrkwb2pl8o4hphbp">
+      <w:hyperlink w:history="1" r:id="rIdkskawfwca9p6mv5ch6yhs">
         <w:r>
           <w:rPr>
             <w:rStyle w:val="Hyperlink"/>
@@ -1695,7 +1695,7 @@
                 <w:sz w:val="22"/>
                 <w:szCs w:val="22"/>
               </w:rPr>
-              <w:t xml:space="preserve">$625</w:t>
+              <w:t xml:space="preserve">$675</w:t>
             </w:r>
           </w:p>
         </w:tc>
@@ -1758,7 +1758,7 @@
                 <w:sz w:val="22"/>
                 <w:szCs w:val="22"/>
               </w:rPr>
-              <w:t xml:space="preserve">$450</w:t>
+              <w:t xml:space="preserve">$525</w:t>
             </w:r>
           </w:p>
         </w:tc>
@@ -1821,7 +1821,7 @@
                 <w:sz w:val="22"/>
                 <w:szCs w:val="22"/>
               </w:rPr>
-              <w:t xml:space="preserve">$350</w:t>
+              <w:t xml:space="preserve">$400</w:t>
             </w:r>
           </w:p>
         </w:tc>

</xml_diff>